<commit_message>
Add contents page to intro website draft
</commit_message>
<xml_diff>
--- a/intro Website/網站內容草稿_第三稿.docx
+++ b/intro Website/網站內容草稿_第三稿.docx
@@ -107,6 +107,626 @@
         </w:rPr>
         <w:t>編排原則：每個小節依照「目的—內容安排—示例或畫面—讀者帶走的重點」展開。最深層的操作項目可以保留少量條列，以方便讀者查閱；其餘內容則以可直接發展成網站文章的段落呈現。</w:t>
       </w:r>
+    </w:p>
+    <w:p>
+      <w:pPr>
+        <w:pageBreakBefore/>
+      </w:pPr>
+    </w:p>
+    <w:p>
+      <w:pPr>
+        <w:spacing w:before="80" w:after="240"/>
+        <w:jc w:val="left"/>
+      </w:pPr>
+      <w:r>
+        <w:rPr>
+          <w:rFonts w:ascii="Apple LiSung" w:hAnsi="Apple LiSung" w:eastAsia="Apple LiSung" w:cs="Apple LiSung"/>
+          <w:b/>
+          <w:color w:val="2E74B5"/>
+          <w:sz w:val="36"/>
+        </w:rPr>
+        <w:t>內容目錄</w:t>
+      </w:r>
+    </w:p>
+    <w:p>
+      <w:pPr>
+        <w:spacing w:before="100" w:after="40"/>
+        <w:ind w:left="0"/>
+      </w:pPr>
+      <w:r>
+        <w:rPr>
+          <w:rFonts w:ascii="Apple LiSung" w:hAnsi="Apple LiSung" w:eastAsia="Apple LiSung" w:cs="Apple LiSung"/>
+          <w:b/>
+          <w:color w:val="1F4D78"/>
+          <w:sz w:val="24"/>
+        </w:rPr>
+        <w:t>一、網站整體定位與閱讀路徑</w:t>
+      </w:r>
+    </w:p>
+    <w:p>
+      <w:pPr>
+        <w:spacing w:before="100" w:after="40"/>
+        <w:ind w:left="0"/>
+      </w:pPr>
+      <w:r>
+        <w:rPr>
+          <w:rFonts w:ascii="Apple LiSung" w:hAnsi="Apple LiSung" w:eastAsia="Apple LiSung" w:cs="Apple LiSung"/>
+          <w:b/>
+          <w:color w:val="1F4D78"/>
+          <w:sz w:val="24"/>
+        </w:rPr>
+        <w:t>二、封面</w:t>
+      </w:r>
+    </w:p>
+    <w:p>
+      <w:pPr>
+        <w:spacing w:before="100" w:after="40"/>
+        <w:ind w:left="0"/>
+      </w:pPr>
+      <w:r>
+        <w:rPr>
+          <w:rFonts w:ascii="Apple LiSung" w:hAnsi="Apple LiSung" w:eastAsia="Apple LiSung" w:cs="Apple LiSung"/>
+          <w:b/>
+          <w:color w:val="1F4D78"/>
+          <w:sz w:val="24"/>
+        </w:rPr>
+        <w:t>三、目錄</w:t>
+      </w:r>
+    </w:p>
+    <w:p>
+      <w:pPr>
+        <w:spacing w:before="100" w:after="40"/>
+        <w:ind w:left="0"/>
+      </w:pPr>
+      <w:r>
+        <w:rPr>
+          <w:rFonts w:ascii="Apple LiSung" w:hAnsi="Apple LiSung" w:eastAsia="Apple LiSung" w:cs="Apple LiSung"/>
+          <w:b/>
+          <w:color w:val="1F4D78"/>
+          <w:sz w:val="24"/>
+        </w:rPr>
+        <w:t>四、導言：為甚麼需要這個平台</w:t>
+      </w:r>
+    </w:p>
+    <w:p>
+      <w:pPr>
+        <w:spacing w:before="40" w:after="40"/>
+        <w:ind w:left="403"/>
+      </w:pPr>
+      <w:r>
+        <w:rPr>
+          <w:rFonts w:ascii="Apple LiSung" w:hAnsi="Apple LiSung" w:eastAsia="Apple LiSung" w:cs="Apple LiSung"/>
+          <w:b w:val="0"/>
+          <w:sz w:val="22"/>
+        </w:rPr>
+        <w:t>4.1 甚麼是奏摺與上諭？</w:t>
+      </w:r>
+    </w:p>
+    <w:p>
+      <w:pPr>
+        <w:spacing w:before="40" w:after="40"/>
+        <w:ind w:left="403"/>
+      </w:pPr>
+      <w:r>
+        <w:rPr>
+          <w:rFonts w:ascii="Apple LiSung" w:hAnsi="Apple LiSung" w:eastAsia="Apple LiSung" w:cs="Apple LiSung"/>
+          <w:b w:val="0"/>
+          <w:sz w:val="22"/>
+        </w:rPr>
+        <w:t>4.2 為甚麼奏摺與上諭重要？</w:t>
+      </w:r>
+    </w:p>
+    <w:p>
+      <w:pPr>
+        <w:spacing w:before="40" w:after="40"/>
+        <w:ind w:left="403"/>
+      </w:pPr>
+      <w:r>
+        <w:rPr>
+          <w:rFonts w:ascii="Apple LiSung" w:hAnsi="Apple LiSung" w:eastAsia="Apple LiSung" w:cs="Apple LiSung"/>
+          <w:b w:val="0"/>
+          <w:sz w:val="22"/>
+        </w:rPr>
+        <w:t>4.3 為甚麼奏摺與上諭難以研究？</w:t>
+      </w:r>
+    </w:p>
+    <w:p>
+      <w:pPr>
+        <w:spacing w:before="40" w:after="40"/>
+        <w:ind w:left="403"/>
+      </w:pPr>
+      <w:r>
+        <w:rPr>
+          <w:rFonts w:ascii="Apple LiSung" w:hAnsi="Apple LiSung" w:eastAsia="Apple LiSung" w:cs="Apple LiSung"/>
+          <w:b w:val="0"/>
+          <w:sz w:val="22"/>
+        </w:rPr>
+        <w:t>4.4 人工智能與數位人文如何協助研究？</w:t>
+      </w:r>
+    </w:p>
+    <w:p>
+      <w:pPr>
+        <w:spacing w:before="40" w:after="40"/>
+        <w:ind w:left="403"/>
+      </w:pPr>
+      <w:r>
+        <w:rPr>
+          <w:rFonts w:ascii="Apple LiSung" w:hAnsi="Apple LiSung" w:eastAsia="Apple LiSung" w:cs="Apple LiSung"/>
+          <w:b w:val="0"/>
+          <w:sz w:val="22"/>
+        </w:rPr>
+        <w:t>4.5 平台簡介</w:t>
+      </w:r>
+    </w:p>
+    <w:p>
+      <w:pPr>
+        <w:spacing w:before="40" w:after="40"/>
+        <w:ind w:left="403"/>
+      </w:pPr>
+      <w:r>
+        <w:rPr>
+          <w:rFonts w:ascii="Apple LiSung" w:hAnsi="Apple LiSung" w:eastAsia="Apple LiSung" w:cs="Apple LiSung"/>
+          <w:b w:val="0"/>
+          <w:sz w:val="22"/>
+        </w:rPr>
+        <w:t>4.6 為甚麼以林爽文事件作為示範？</w:t>
+      </w:r>
+    </w:p>
+    <w:p>
+      <w:pPr>
+        <w:spacing w:before="40" w:after="40"/>
+        <w:ind w:left="403"/>
+      </w:pPr>
+      <w:r>
+        <w:rPr>
+          <w:rFonts w:ascii="Apple LiSung" w:hAnsi="Apple LiSung" w:eastAsia="Apple LiSung" w:cs="Apple LiSung"/>
+          <w:b w:val="0"/>
+          <w:sz w:val="22"/>
+        </w:rPr>
+        <w:t>4.7 本網站的目的</w:t>
+      </w:r>
+    </w:p>
+    <w:p>
+      <w:pPr>
+        <w:spacing w:before="100" w:after="40"/>
+        <w:ind w:left="0"/>
+      </w:pPr>
+      <w:r>
+        <w:rPr>
+          <w:rFonts w:ascii="Apple LiSung" w:hAnsi="Apple LiSung" w:eastAsia="Apple LiSung" w:cs="Apple LiSung"/>
+          <w:b/>
+          <w:color w:val="1F4D78"/>
+          <w:sz w:val="24"/>
+        </w:rPr>
+        <w:t>五、平台介紹：由整體介面到核心流程</w:t>
+      </w:r>
+    </w:p>
+    <w:p>
+      <w:pPr>
+        <w:spacing w:before="40" w:after="40"/>
+        <w:ind w:left="403"/>
+      </w:pPr>
+      <w:r>
+        <w:rPr>
+          <w:rFonts w:ascii="Apple LiSung" w:hAnsi="Apple LiSung" w:eastAsia="Apple LiSung" w:cs="Apple LiSung"/>
+          <w:b w:val="0"/>
+          <w:sz w:val="22"/>
+        </w:rPr>
+        <w:t>5.1 第一印象：網站介面</w:t>
+      </w:r>
+    </w:p>
+    <w:p>
+      <w:pPr>
+        <w:spacing w:before="40" w:after="40"/>
+        <w:ind w:left="403"/>
+      </w:pPr>
+      <w:r>
+        <w:rPr>
+          <w:rFonts w:ascii="Apple LiSung" w:hAnsi="Apple LiSung" w:eastAsia="Apple LiSung" w:cs="Apple LiSung"/>
+          <w:b w:val="0"/>
+          <w:sz w:val="22"/>
+        </w:rPr>
+        <w:t>5.2 整體研究流程</w:t>
+      </w:r>
+    </w:p>
+    <w:p>
+      <w:pPr>
+        <w:spacing w:before="40" w:after="40"/>
+        <w:ind w:left="403"/>
+      </w:pPr>
+      <w:r>
+        <w:rPr>
+          <w:rFonts w:ascii="Apple LiSung" w:hAnsi="Apple LiSung" w:eastAsia="Apple LiSung" w:cs="Apple LiSung"/>
+          <w:b w:val="0"/>
+          <w:sz w:val="22"/>
+        </w:rPr>
+        <w:t>5.3 核心流程模組</w:t>
+      </w:r>
+    </w:p>
+    <w:p>
+      <w:pPr>
+        <w:spacing w:before="40" w:after="40"/>
+        <w:ind w:left="806"/>
+      </w:pPr>
+      <w:r>
+        <w:rPr>
+          <w:rFonts w:ascii="Apple LiSung" w:hAnsi="Apple LiSung" w:eastAsia="Apple LiSung" w:cs="Apple LiSung"/>
+          <w:b w:val="0"/>
+          <w:sz w:val="22"/>
+        </w:rPr>
+        <w:t>5.3.1 OCR 與結構化資料</w:t>
+      </w:r>
+    </w:p>
+    <w:p>
+      <w:pPr>
+        <w:spacing w:before="40" w:after="40"/>
+        <w:ind w:left="806"/>
+      </w:pPr>
+      <w:r>
+        <w:rPr>
+          <w:rFonts w:ascii="Apple LiSung" w:hAnsi="Apple LiSung" w:eastAsia="Apple LiSung" w:cs="Apple LiSung"/>
+          <w:b w:val="0"/>
+          <w:sz w:val="22"/>
+        </w:rPr>
+        <w:t>5.3.2 甚麼是人工智能技能？</w:t>
+      </w:r>
+    </w:p>
+    <w:p>
+      <w:pPr>
+        <w:spacing w:before="40" w:after="40"/>
+        <w:ind w:left="806"/>
+      </w:pPr>
+      <w:r>
+        <w:rPr>
+          <w:rFonts w:ascii="Apple LiSung" w:hAnsi="Apple LiSung" w:eastAsia="Apple LiSung" w:cs="Apple LiSung"/>
+          <w:b w:val="0"/>
+          <w:sz w:val="22"/>
+        </w:rPr>
+        <w:t>5.3.3 重建通信關係</w:t>
+      </w:r>
+    </w:p>
+    <w:p>
+      <w:pPr>
+        <w:spacing w:before="40" w:after="40"/>
+        <w:ind w:left="806"/>
+      </w:pPr>
+      <w:r>
+        <w:rPr>
+          <w:rFonts w:ascii="Apple LiSung" w:hAnsi="Apple LiSung" w:eastAsia="Apple LiSung" w:cs="Apple LiSung"/>
+          <w:b w:val="0"/>
+          <w:sz w:val="22"/>
+        </w:rPr>
+        <w:t>5.3.4 資訊提取的核心理念</w:t>
+      </w:r>
+    </w:p>
+    <w:p>
+      <w:pPr>
+        <w:spacing w:before="40" w:after="40"/>
+        <w:ind w:left="806"/>
+      </w:pPr>
+      <w:r>
+        <w:rPr>
+          <w:rFonts w:ascii="Apple LiSung" w:hAnsi="Apple LiSung" w:eastAsia="Apple LiSung" w:cs="Apple LiSung"/>
+          <w:b w:val="0"/>
+          <w:sz w:val="22"/>
+        </w:rPr>
+        <w:t>5.3.4.1 奏摺分析分支</w:t>
+      </w:r>
+    </w:p>
+    <w:p>
+      <w:pPr>
+        <w:spacing w:before="40" w:after="40"/>
+        <w:ind w:left="806"/>
+      </w:pPr>
+      <w:r>
+        <w:rPr>
+          <w:rFonts w:ascii="Apple LiSung" w:hAnsi="Apple LiSung" w:eastAsia="Apple LiSung" w:cs="Apple LiSung"/>
+          <w:b w:val="0"/>
+          <w:sz w:val="22"/>
+        </w:rPr>
+        <w:t>5.3.4.2 上諭分析分支</w:t>
+      </w:r>
+    </w:p>
+    <w:p>
+      <w:pPr>
+        <w:spacing w:before="40" w:after="40"/>
+        <w:ind w:left="806"/>
+      </w:pPr>
+      <w:r>
+        <w:rPr>
+          <w:rFonts w:ascii="Apple LiSung" w:hAnsi="Apple LiSung" w:eastAsia="Apple LiSung" w:cs="Apple LiSung"/>
+          <w:b w:val="0"/>
+          <w:sz w:val="22"/>
+        </w:rPr>
+        <w:t>5.3.4.3 每項技能的展示方式</w:t>
+      </w:r>
+    </w:p>
+    <w:p>
+      <w:pPr>
+        <w:spacing w:before="40" w:after="40"/>
+        <w:ind w:left="403"/>
+      </w:pPr>
+      <w:r>
+        <w:rPr>
+          <w:rFonts w:ascii="Apple LiSung" w:hAnsi="Apple LiSung" w:eastAsia="Apple LiSung" w:cs="Apple LiSung"/>
+          <w:b w:val="0"/>
+          <w:sz w:val="22"/>
+        </w:rPr>
+        <w:t>5.4 網站介面：由圖表回到原文</w:t>
+      </w:r>
+    </w:p>
+    <w:p>
+      <w:pPr>
+        <w:spacing w:before="40" w:after="40"/>
+        <w:ind w:left="806"/>
+      </w:pPr>
+      <w:r>
+        <w:rPr>
+          <w:rFonts w:ascii="Apple LiSung" w:hAnsi="Apple LiSung" w:eastAsia="Apple LiSung" w:cs="Apple LiSung"/>
+          <w:b w:val="0"/>
+          <w:sz w:val="22"/>
+        </w:rPr>
+        <w:t>5.4.1 四線圖表：呈現時間、事件和通信</w:t>
+      </w:r>
+    </w:p>
+    <w:p>
+      <w:pPr>
+        <w:spacing w:before="40" w:after="40"/>
+        <w:ind w:left="806"/>
+      </w:pPr>
+      <w:r>
+        <w:rPr>
+          <w:rFonts w:ascii="Apple LiSung" w:hAnsi="Apple LiSung" w:eastAsia="Apple LiSung" w:cs="Apple LiSung"/>
+          <w:b w:val="0"/>
+          <w:sz w:val="22"/>
+        </w:rPr>
+        <w:t>5.4.2 文書區與人工智能分析區</w:t>
+      </w:r>
+    </w:p>
+    <w:p>
+      <w:pPr>
+        <w:spacing w:before="40" w:after="40"/>
+        <w:ind w:left="806"/>
+      </w:pPr>
+      <w:r>
+        <w:rPr>
+          <w:rFonts w:ascii="Apple LiSung" w:hAnsi="Apple LiSung" w:eastAsia="Apple LiSung" w:cs="Apple LiSung"/>
+          <w:b w:val="0"/>
+          <w:sz w:val="22"/>
+        </w:rPr>
+        <w:t>5.4.3 節點資訊區</w:t>
+      </w:r>
+    </w:p>
+    <w:p>
+      <w:pPr>
+        <w:spacing w:before="40" w:after="40"/>
+        <w:ind w:left="806"/>
+      </w:pPr>
+      <w:r>
+        <w:rPr>
+          <w:rFonts w:ascii="Apple LiSung" w:hAnsi="Apple LiSung" w:eastAsia="Apple LiSung" w:cs="Apple LiSung"/>
+          <w:b w:val="0"/>
+          <w:sz w:val="22"/>
+        </w:rPr>
+        <w:t>5.4.4 Event Line：把節點網絡讀成歷史敘事</w:t>
+      </w:r>
+    </w:p>
+    <w:p>
+      <w:pPr>
+        <w:spacing w:before="100" w:after="40"/>
+        <w:ind w:left="0"/>
+      </w:pPr>
+      <w:r>
+        <w:rPr>
+          <w:rFonts w:ascii="Apple LiSung" w:hAnsi="Apple LiSung" w:eastAsia="Apple LiSung" w:cs="Apple LiSung"/>
+          <w:b/>
+          <w:color w:val="1F4D78"/>
+          <w:sz w:val="24"/>
+        </w:rPr>
+        <w:t>六、重用平台於其他研究主題</w:t>
+      </w:r>
+    </w:p>
+    <w:p>
+      <w:pPr>
+        <w:spacing w:before="40" w:after="40"/>
+        <w:ind w:left="403"/>
+      </w:pPr>
+      <w:r>
+        <w:rPr>
+          <w:rFonts w:ascii="Apple LiSung" w:hAnsi="Apple LiSung" w:eastAsia="Apple LiSung" w:cs="Apple LiSung"/>
+          <w:b w:val="0"/>
+          <w:sz w:val="22"/>
+        </w:rPr>
+        <w:t>6.1 所需工具與資源</w:t>
+      </w:r>
+    </w:p>
+    <w:p>
+      <w:pPr>
+        <w:spacing w:before="40" w:after="40"/>
+        <w:ind w:left="403"/>
+      </w:pPr>
+      <w:r>
+        <w:rPr>
+          <w:rFonts w:ascii="Apple LiSung" w:hAnsi="Apple LiSung" w:eastAsia="Apple LiSung" w:cs="Apple LiSung"/>
+          <w:b w:val="0"/>
+          <w:sz w:val="22"/>
+        </w:rPr>
+        <w:t>6.2 準備新的歷史材料</w:t>
+      </w:r>
+    </w:p>
+    <w:p>
+      <w:pPr>
+        <w:spacing w:before="40" w:after="40"/>
+        <w:ind w:left="403"/>
+      </w:pPr>
+      <w:r>
+        <w:rPr>
+          <w:rFonts w:ascii="Apple LiSung" w:hAnsi="Apple LiSung" w:eastAsia="Apple LiSung" w:cs="Apple LiSung"/>
+          <w:b w:val="0"/>
+          <w:sz w:val="22"/>
+        </w:rPr>
+        <w:t>6.3 載入資料與重建通信關係</w:t>
+      </w:r>
+    </w:p>
+    <w:p>
+      <w:pPr>
+        <w:spacing w:before="40" w:after="40"/>
+        <w:ind w:left="403"/>
+      </w:pPr>
+      <w:r>
+        <w:rPr>
+          <w:rFonts w:ascii="Apple LiSung" w:hAnsi="Apple LiSung" w:eastAsia="Apple LiSung" w:cs="Apple LiSung"/>
+          <w:b w:val="0"/>
+          <w:sz w:val="22"/>
+        </w:rPr>
+        <w:t>6.4 重用及調整資訊提取框架</w:t>
+      </w:r>
+    </w:p>
+    <w:p>
+      <w:pPr>
+        <w:spacing w:before="40" w:after="40"/>
+        <w:ind w:left="403"/>
+      </w:pPr>
+      <w:r>
+        <w:rPr>
+          <w:rFonts w:ascii="Apple LiSung" w:hAnsi="Apple LiSung" w:eastAsia="Apple LiSung" w:cs="Apple LiSung"/>
+          <w:b w:val="0"/>
+          <w:sz w:val="22"/>
+        </w:rPr>
+        <w:t>6.5 AI 處理循環</w:t>
+      </w:r>
+    </w:p>
+    <w:p>
+      <w:pPr>
+        <w:spacing w:before="40" w:after="40"/>
+        <w:ind w:left="403"/>
+      </w:pPr>
+      <w:r>
+        <w:rPr>
+          <w:rFonts w:ascii="Apple LiSung" w:hAnsi="Apple LiSung" w:eastAsia="Apple LiSung" w:cs="Apple LiSung"/>
+          <w:b w:val="0"/>
+          <w:sz w:val="22"/>
+        </w:rPr>
+        <w:t>6.6 人文核驗與反覆修正</w:t>
+      </w:r>
+    </w:p>
+    <w:p>
+      <w:pPr>
+        <w:spacing w:before="40" w:after="40"/>
+        <w:ind w:left="403"/>
+      </w:pPr>
+      <w:r>
+        <w:rPr>
+          <w:rFonts w:ascii="Apple LiSung" w:hAnsi="Apple LiSung" w:eastAsia="Apple LiSung" w:cs="Apple LiSung"/>
+          <w:b w:val="0"/>
+          <w:sz w:val="22"/>
+        </w:rPr>
+        <w:t>6.7 修改與擴展網站</w:t>
+      </w:r>
+    </w:p>
+    <w:p>
+      <w:pPr>
+        <w:spacing w:before="100" w:after="40"/>
+        <w:ind w:left="0"/>
+      </w:pPr>
+      <w:r>
+        <w:rPr>
+          <w:rFonts w:ascii="Apple LiSung" w:hAnsi="Apple LiSung" w:eastAsia="Apple LiSung" w:cs="Apple LiSung"/>
+          <w:b/>
+          <w:color w:val="1F4D78"/>
+          <w:sz w:val="24"/>
+        </w:rPr>
+        <w:t>七、研究示範：林爽文事件</w:t>
+      </w:r>
+    </w:p>
+    <w:p>
+      <w:pPr>
+        <w:spacing w:before="40" w:after="40"/>
+        <w:ind w:left="403"/>
+      </w:pPr>
+      <w:r>
+        <w:rPr>
+          <w:rFonts w:ascii="Apple LiSung" w:hAnsi="Apple LiSung" w:eastAsia="Apple LiSung" w:cs="Apple LiSung"/>
+          <w:b w:val="0"/>
+          <w:sz w:val="22"/>
+        </w:rPr>
+        <w:t>7.1 示範資料與研究範圍</w:t>
+      </w:r>
+    </w:p>
+    <w:p>
+      <w:pPr>
+        <w:spacing w:before="40" w:after="40"/>
+        <w:ind w:left="403"/>
+      </w:pPr>
+      <w:r>
+        <w:rPr>
+          <w:rFonts w:ascii="Apple LiSung" w:hAnsi="Apple LiSung" w:eastAsia="Apple LiSung" w:cs="Apple LiSung"/>
+          <w:b w:val="0"/>
+          <w:sz w:val="22"/>
+        </w:rPr>
+        <w:t>7.2 從圖表重建資訊傳遞</w:t>
+      </w:r>
+    </w:p>
+    <w:p>
+      <w:pPr>
+        <w:spacing w:before="40" w:after="40"/>
+        <w:ind w:left="403"/>
+      </w:pPr>
+      <w:r>
+        <w:rPr>
+          <w:rFonts w:ascii="Apple LiSung" w:hAnsi="Apple LiSung" w:eastAsia="Apple LiSung" w:cs="Apple LiSung"/>
+          <w:b w:val="0"/>
+          <w:sz w:val="22"/>
+        </w:rPr>
+        <w:t>7.3 資訊延遲與軍事決策</w:t>
+      </w:r>
+    </w:p>
+    <w:p>
+      <w:pPr>
+        <w:spacing w:before="40" w:after="40"/>
+        <w:ind w:left="403"/>
+      </w:pPr>
+      <w:r>
+        <w:rPr>
+          <w:rFonts w:ascii="Apple LiSung" w:hAnsi="Apple LiSung" w:eastAsia="Apple LiSung" w:cs="Apple LiSung"/>
+          <w:b w:val="0"/>
+          <w:sz w:val="22"/>
+        </w:rPr>
+        <w:t>7.4 平台帶來的歷史研究可能性</w:t>
+      </w:r>
+    </w:p>
+    <w:p>
+      <w:pPr>
+        <w:spacing w:before="100" w:after="40"/>
+        <w:ind w:left="0"/>
+      </w:pPr>
+      <w:r>
+        <w:rPr>
+          <w:rFonts w:ascii="Apple LiSung" w:hAnsi="Apple LiSung" w:eastAsia="Apple LiSung" w:cs="Apple LiSung"/>
+          <w:b/>
+          <w:color w:val="1F4D78"/>
+          <w:sz w:val="24"/>
+        </w:rPr>
+        <w:t>八、結語：人工智能協助，研究者判斷</w:t>
+      </w:r>
+    </w:p>
+    <w:p>
+      <w:pPr>
+        <w:spacing w:before="200" w:after="160"/>
+      </w:pPr>
+      <w:r>
+        <w:rPr>
+          <w:rFonts w:ascii="Apple LiSung" w:hAnsi="Apple LiSung" w:eastAsia="Apple LiSung" w:cs="Apple LiSung"/>
+          <w:color w:val="5F6368"/>
+          <w:sz w:val="20"/>
+        </w:rPr>
+        <w:t>註：本目錄用於第三稿的內容導航；正式網站版本可再改為帶有頁面連結的互動目錄。</w:t>
+      </w:r>
+    </w:p>
+    <w:p>
+      <w:pPr>
+        <w:pageBreakBefore/>
+      </w:pPr>
     </w:p>
     <w:p>
       <w:pPr>

</xml_diff>